<commit_message>
Ablation: share identical reads across systems within a run
Systems that differ only after the reads now see the same reads (paired
comparison); a run drops from ~4,000 to ~1,500 calls. Nothing is kept
between runs or written to disk; ./run is unchanged. Shorter README and
the edited write-up.

Co-Authored-By: Claude Opus 5.5 <noreply@anthropic.com>
Claude-Session: https://claude.ai/code/session_01SvDoZtFYfQ1QRWL6xYWtTj
</commit_message>
<xml_diff>
--- a/docs/writeup.docx
+++ b/docs/writeup.docx
@@ -62,43 +62,76 @@
           <w:sz w:val="20"/>
           <w:szCs w:val="20"/>
         </w:rPr>
-        <w:t xml:space="preserve">Every item is two problems stacked. First, </w:t>
-      </w:r>
-      <w:r>
-        <w:rPr>
-          <w:rFonts w:ascii="Calibri" w:cs="Calibri" w:eastAsia="Calibri" w:hAnsi="Calibri"/>
-          <w:i/>
-          <w:iCs/>
-          <w:sz w:val="20"/>
-          <w:szCs w:val="20"/>
-        </w:rPr>
-        <w:t xml:space="preserve">understand</w:t>
-      </w:r>
-      <w:r>
-        <w:rPr>
-          <w:rFonts w:ascii="Calibri" w:cs="Calibri" w:eastAsia="Calibri" w:hAnsi="Calibri"/>
-          <w:sz w:val="20"/>
-          <w:szCs w:val="20"/>
-        </w:rPr>
-        <w:t xml:space="preserve"> the notes: which lines are constraints, and what each one says. Second, </w:t>
-      </w:r>
-      <w:r>
-        <w:rPr>
-          <w:rFonts w:ascii="Calibri" w:cs="Calibri" w:eastAsia="Calibri" w:hAnsi="Calibri"/>
-          <w:i/>
-          <w:iCs/>
-          <w:sz w:val="20"/>
-          <w:szCs w:val="20"/>
-        </w:rPr>
-        <w:t xml:space="preserve">arrange</w:t>
-      </w:r>
-      <w:r>
-        <w:rPr>
-          <w:rFonts w:ascii="Calibri" w:cs="Calibri" w:eastAsia="Calibri" w:hAnsi="Calibri"/>
-          <w:sz w:val="20"/>
-          <w:szCs w:val="20"/>
-        </w:rPr>
-        <w:t xml:space="preserve">: find every assignment of people to blocks and holders to stations that satisfies them all, and decide unique, ambiguous or inconsistent. An 8B model is poor at the second part: it has to hold five people, five blocks and three stations in its head and check every constraint against every candidate. Without a harness Granite scores </w:t>
+        <w:t xml:space="preserve">Every item is two problems stacked.</w:t>
+      </w:r>
+    </w:p>
+    <w:p>
+      <w:pPr>
+        <w:pStyle w:val="ListParagraph"/>
+        <w:numPr>
+          <w:ilvl w:val="0"/>
+          <w:numId w:val="2"/>
+        </w:numPr>
+        <w:spacing w:after="20" w:line="240"/>
+      </w:pPr>
+      <w:r>
+        <w:rPr>
+          <w:rFonts w:ascii="Calibri" w:cs="Calibri" w:eastAsia="Calibri" w:hAnsi="Calibri"/>
+          <w:b/>
+          <w:bCs/>
+          <w:sz w:val="20"/>
+          <w:szCs w:val="20"/>
+        </w:rPr>
+        <w:t xml:space="preserve">Understand</w:t>
+      </w:r>
+      <w:r>
+        <w:rPr>
+          <w:rFonts w:ascii="Calibri" w:cs="Calibri" w:eastAsia="Calibri" w:hAnsi="Calibri"/>
+          <w:sz w:val="20"/>
+          <w:szCs w:val="20"/>
+        </w:rPr>
+        <w:t xml:space="preserve"> the notes: which lines are constraints, and what each one says.</w:t>
+      </w:r>
+    </w:p>
+    <w:p>
+      <w:pPr>
+        <w:pStyle w:val="ListParagraph"/>
+        <w:numPr>
+          <w:ilvl w:val="0"/>
+          <w:numId w:val="2"/>
+        </w:numPr>
+        <w:spacing w:after="20" w:line="240"/>
+      </w:pPr>
+      <w:r>
+        <w:rPr>
+          <w:rFonts w:ascii="Calibri" w:cs="Calibri" w:eastAsia="Calibri" w:hAnsi="Calibri"/>
+          <w:b/>
+          <w:bCs/>
+          <w:sz w:val="20"/>
+          <w:szCs w:val="20"/>
+        </w:rPr>
+        <w:t xml:space="preserve">Arrange:</w:t>
+      </w:r>
+      <w:r>
+        <w:rPr>
+          <w:rFonts w:ascii="Calibri" w:cs="Calibri" w:eastAsia="Calibri" w:hAnsi="Calibri"/>
+          <w:sz w:val="20"/>
+          <w:szCs w:val="20"/>
+        </w:rPr>
+        <w:t xml:space="preserve"> find every assignment of people to blocks and holders to stations that satisfies them all, and decide unique, ambiguous or inconsistent.</w:t>
+      </w:r>
+    </w:p>
+    <w:p>
+      <w:pPr>
+        <w:spacing w:after="80" w:line="240"/>
+      </w:pPr>
+      <w:r>
+        <w:rPr>
+          <w:rFonts w:ascii="Calibri" w:cs="Calibri" w:eastAsia="Calibri" w:hAnsi="Calibri"/>
+          <w:sz w:val="20"/>
+          <w:szCs w:val="20"/>
+        </w:rPr>
+        <w:t xml:space="preserve">An 8B model is poor at the second part: it has to hold five people, five blocks and three stations in its head and check every constraint against every candidate. Without a harness Granite scores </w:t>
       </w:r>
       <w:r>
         <w:rPr>
@@ -116,7 +149,7 @@
           <w:sz w:val="20"/>
           <w:szCs w:val="20"/>
         </w:rPr>
-        <w:t xml:space="preserve"> (the brief's own measurement).</w:t>
+        <w:t xml:space="preserve">.</w:t>
       </w:r>
     </w:p>
     <w:p>
@@ -221,7 +254,7 @@
         <w:pStyle w:val="ListParagraph"/>
         <w:numPr>
           <w:ilvl w:val="0"/>
-          <w:numId w:val="2"/>
+          <w:numId w:val="3"/>
         </w:numPr>
         <w:spacing w:after="30" w:line="240"/>
       </w:pPr>
@@ -258,7 +291,7 @@
         <w:pStyle w:val="ListParagraph"/>
         <w:numPr>
           <w:ilvl w:val="0"/>
-          <w:numId w:val="2"/>
+          <w:numId w:val="3"/>
         </w:numPr>
         <w:spacing w:after="30" w:line="240"/>
       </w:pPr>
@@ -295,7 +328,7 @@
         <w:pStyle w:val="ListParagraph"/>
         <w:numPr>
           <w:ilvl w:val="0"/>
-          <w:numId w:val="2"/>
+          <w:numId w:val="3"/>
         </w:numPr>
         <w:spacing w:after="30" w:line="240"/>
       </w:pPr>
@@ -512,7 +545,7 @@
         <w:pStyle w:val="ListParagraph"/>
         <w:numPr>
           <w:ilvl w:val="0"/>
-          <w:numId w:val="2"/>
+          <w:numId w:val="3"/>
         </w:numPr>
         <w:spacing w:after="30" w:line="240"/>
       </w:pPr>
@@ -557,7 +590,7 @@
         <w:pStyle w:val="ListParagraph"/>
         <w:numPr>
           <w:ilvl w:val="0"/>
-          <w:numId w:val="2"/>
+          <w:numId w:val="3"/>
         </w:numPr>
         <w:spacing w:after="30" w:line="240"/>
       </w:pPr>
@@ -602,7 +635,7 @@
         <w:pStyle w:val="ListParagraph"/>
         <w:numPr>
           <w:ilvl w:val="0"/>
-          <w:numId w:val="2"/>
+          <w:numId w:val="3"/>
         </w:numPr>
         <w:spacing w:after="30" w:line="240"/>
       </w:pPr>
@@ -682,7 +715,7 @@
         <w:pStyle w:val="ListParagraph"/>
         <w:numPr>
           <w:ilvl w:val="0"/>
-          <w:numId w:val="2"/>
+          <w:numId w:val="3"/>
         </w:numPr>
         <w:spacing w:after="30" w:line="240"/>
       </w:pPr>
@@ -710,7 +743,7 @@
         <w:pStyle w:val="ListParagraph"/>
         <w:numPr>
           <w:ilvl w:val="0"/>
-          <w:numId w:val="2"/>
+          <w:numId w:val="3"/>
         </w:numPr>
         <w:spacing w:after="30" w:line="240"/>
       </w:pPr>
@@ -738,7 +771,7 @@
         <w:pStyle w:val="ListParagraph"/>
         <w:numPr>
           <w:ilvl w:val="0"/>
-          <w:numId w:val="2"/>
+          <w:numId w:val="3"/>
         </w:numPr>
         <w:spacing w:after="30" w:line="240"/>
       </w:pPr>
@@ -796,7 +829,7 @@
         <w:pStyle w:val="ListParagraph"/>
         <w:numPr>
           <w:ilvl w:val="0"/>
-          <w:numId w:val="2"/>
+          <w:numId w:val="3"/>
         </w:numPr>
         <w:spacing w:after="30" w:line="240"/>
       </w:pPr>
@@ -842,7 +875,7 @@
         <w:pStyle w:val="ListParagraph"/>
         <w:numPr>
           <w:ilvl w:val="0"/>
-          <w:numId w:val="2"/>
+          <w:numId w:val="3"/>
         </w:numPr>
         <w:spacing w:after="30" w:line="240"/>
       </w:pPr>
@@ -879,15 +912,15 @@
           <w:sz w:val="20"/>
           <w:szCs w:val="20"/>
         </w:rPr>
-        <w:t xml:space="preserve">, direction words, a station as the subject). Fresh wording because the held-out set uses phrasing this set doesn't.</w:t>
-      </w:r>
-    </w:p>
-    <w:p>
-      <w:pPr>
-        <w:pStyle w:val="ListParagraph"/>
-        <w:numPr>
-          <w:ilvl w:val="0"/>
-          <w:numId w:val="2"/>
+        <w:t xml:space="preserve">, direction words, a station as the subject). Fresh wording because our system should be robust against a change in wording.</w:t>
+      </w:r>
+    </w:p>
+    <w:p>
+      <w:pPr>
+        <w:pStyle w:val="ListParagraph"/>
+        <w:numPr>
+          <w:ilvl w:val="0"/>
+          <w:numId w:val="3"/>
         </w:numPr>
         <w:spacing w:after="30" w:line="240"/>
       </w:pPr>
@@ -1018,7 +1051,7 @@
         <w:pStyle w:val="ListParagraph"/>
         <w:numPr>
           <w:ilvl w:val="0"/>
-          <w:numId w:val="2"/>
+          <w:numId w:val="3"/>
         </w:numPr>
         <w:spacing w:after="30" w:line="240"/>
       </w:pPr>
@@ -1094,7 +1127,7 @@
         <w:pStyle w:val="ListParagraph"/>
         <w:numPr>
           <w:ilvl w:val="0"/>
-          <w:numId w:val="2"/>
+          <w:numId w:val="3"/>
         </w:numPr>
         <w:spacing w:after="30" w:line="240"/>
       </w:pPr>
@@ -1140,7 +1173,7 @@
         <w:pStyle w:val="ListParagraph"/>
         <w:numPr>
           <w:ilvl w:val="0"/>
-          <w:numId w:val="2"/>
+          <w:numId w:val="3"/>
         </w:numPr>
         <w:spacing w:after="30" w:line="240"/>
       </w:pPr>
@@ -1168,7 +1201,7 @@
         <w:pStyle w:val="ListParagraph"/>
         <w:numPr>
           <w:ilvl w:val="0"/>
-          <w:numId w:val="2"/>
+          <w:numId w:val="3"/>
         </w:numPr>
         <w:spacing w:after="30" w:line="240"/>
       </w:pPr>
@@ -1386,7 +1419,7 @@
         <w:pStyle w:val="ListParagraph"/>
         <w:numPr>
           <w:ilvl w:val="0"/>
-          <w:numId w:val="2"/>
+          <w:numId w:val="3"/>
         </w:numPr>
         <w:spacing w:after="30" w:line="240"/>
       </w:pPr>
@@ -1449,7 +1482,7 @@
         <w:pStyle w:val="ListParagraph"/>
         <w:numPr>
           <w:ilvl w:val="0"/>
-          <w:numId w:val="2"/>
+          <w:numId w:val="3"/>
         </w:numPr>
         <w:spacing w:after="30" w:line="240"/>
       </w:pPr>
@@ -1477,7 +1510,7 @@
         <w:pStyle w:val="ListParagraph"/>
         <w:numPr>
           <w:ilvl w:val="0"/>
-          <w:numId w:val="2"/>
+          <w:numId w:val="3"/>
         </w:numPr>
         <w:spacing w:after="30" w:line="240"/>
       </w:pPr>
@@ -1505,7 +1538,7 @@
         <w:pStyle w:val="ListParagraph"/>
         <w:numPr>
           <w:ilvl w:val="0"/>
-          <w:numId w:val="2"/>
+          <w:numId w:val="3"/>
         </w:numPr>
         <w:spacing w:after="30" w:line="240"/>
       </w:pPr>
@@ -1550,7 +1583,7 @@
         <w:pStyle w:val="ListParagraph"/>
         <w:numPr>
           <w:ilvl w:val="0"/>
-          <w:numId w:val="2"/>
+          <w:numId w:val="3"/>
         </w:numPr>
         <w:spacing w:after="30" w:line="240"/>
       </w:pPr>
@@ -1630,7 +1663,7 @@
         <w:pStyle w:val="ListParagraph"/>
         <w:numPr>
           <w:ilvl w:val="0"/>
-          <w:numId w:val="2"/>
+          <w:numId w:val="3"/>
         </w:numPr>
         <w:spacing w:after="30" w:line="240"/>
       </w:pPr>
@@ -1694,7 +1727,7 @@
         <w:pStyle w:val="ListParagraph"/>
         <w:numPr>
           <w:ilvl w:val="0"/>
-          <w:numId w:val="2"/>
+          <w:numId w:val="3"/>
         </w:numPr>
         <w:spacing w:after="30" w:line="240"/>
       </w:pPr>
@@ -1757,7 +1790,7 @@
         <w:pStyle w:val="ListParagraph"/>
         <w:numPr>
           <w:ilvl w:val="0"/>
-          <w:numId w:val="2"/>
+          <w:numId w:val="3"/>
         </w:numPr>
         <w:spacing w:after="30" w:line="240"/>
       </w:pPr>
@@ -1785,7 +1818,7 @@
         <w:pStyle w:val="ListParagraph"/>
         <w:numPr>
           <w:ilvl w:val="0"/>
-          <w:numId w:val="2"/>
+          <w:numId w:val="3"/>
         </w:numPr>
         <w:spacing w:after="30" w:line="240"/>
       </w:pPr>
@@ -1861,7 +1894,7 @@
         <w:pStyle w:val="ListParagraph"/>
         <w:numPr>
           <w:ilvl w:val="0"/>
-          <w:numId w:val="2"/>
+          <w:numId w:val="3"/>
         </w:numPr>
         <w:spacing w:after="30" w:line="240"/>
       </w:pPr>
@@ -1925,7 +1958,7 @@
         <w:pStyle w:val="ListParagraph"/>
         <w:numPr>
           <w:ilvl w:val="0"/>
-          <w:numId w:val="2"/>
+          <w:numId w:val="3"/>
         </w:numPr>
         <w:spacing w:after="30" w:line="240"/>
       </w:pPr>
@@ -1989,7 +2022,7 @@
         <w:pStyle w:val="ListParagraph"/>
         <w:numPr>
           <w:ilvl w:val="0"/>
-          <w:numId w:val="2"/>
+          <w:numId w:val="3"/>
         </w:numPr>
         <w:spacing w:after="30" w:line="240"/>
       </w:pPr>
@@ -2034,7 +2067,7 @@
         <w:pStyle w:val="ListParagraph"/>
         <w:numPr>
           <w:ilvl w:val="0"/>
-          <w:numId w:val="2"/>
+          <w:numId w:val="3"/>
         </w:numPr>
         <w:spacing w:after="30" w:line="240"/>
       </w:pPr>
@@ -2062,7 +2095,7 @@
         <w:pStyle w:val="ListParagraph"/>
         <w:numPr>
           <w:ilvl w:val="0"/>
-          <w:numId w:val="2"/>
+          <w:numId w:val="3"/>
         </w:numPr>
         <w:spacing w:after="30" w:line="240"/>
       </w:pPr>
@@ -2090,7 +2123,7 @@
         <w:pStyle w:val="ListParagraph"/>
         <w:numPr>
           <w:ilvl w:val="0"/>
-          <w:numId w:val="2"/>
+          <w:numId w:val="3"/>
         </w:numPr>
         <w:spacing w:after="30" w:line="240"/>
       </w:pPr>
@@ -2118,7 +2151,7 @@
         <w:pStyle w:val="ListParagraph"/>
         <w:numPr>
           <w:ilvl w:val="0"/>
-          <w:numId w:val="2"/>
+          <w:numId w:val="3"/>
         </w:numPr>
         <w:spacing w:after="30" w:line="240"/>
       </w:pPr>
@@ -2142,7 +2175,7 @@
       </w:r>
     </w:p>
     <w:sectPr>
-      <w:pgSz w:w="11906" w:h="16838" w:orient="portrait"/>
+      <w:pgSz w:w="12240" w:h="15840" w:orient="portrait"/>
       <w:pgMar w:top="800" w:right="950" w:bottom="800" w:left="950" w:header="708" w:footer="708" w:gutter="0"/>
       <w:pgNumType/>
       <w:docGrid w:linePitch="360"/>
@@ -2319,6 +2352,18 @@
     <w:multiLevelType w:val="hybridMultilevel"/>
     <w:lvl w:ilvl="0" w15:tentative="1">
       <w:start w:val="1"/>
+      <w:numFmt w:val="decimal"/>
+      <w:lvlText w:val="%1."/>
+      <w:lvlJc w:val="left"/>
+      <w:pPr>
+        <w:ind w:left="300" w:hanging="220"/>
+      </w:pPr>
+    </w:lvl>
+  </w:abstractNum>
+  <w:abstractNum w:abstractNumId="3" w15:restartNumberingAfterBreak="0">
+    <w:multiLevelType w:val="hybridMultilevel"/>
+    <w:lvl w:ilvl="0" w15:tentative="1">
+      <w:start w:val="1"/>
       <w:numFmt w:val="bullet"/>
       <w:lvlText w:val="•"/>
       <w:lvlJc w:val="left"/>
@@ -2335,6 +2380,12 @@
   </w:num>
   <w:num w:numId="2">
     <w:abstractNumId w:val="2"/>
+    <w:lvlOverride w:ilvl="0">
+      <w:startOverride w:val="1"/>
+    </w:lvlOverride>
+  </w:num>
+  <w:num w:numId="3">
+    <w:abstractNumId w:val="3"/>
     <w:lvlOverride w:ilvl="0">
       <w:startOverride w:val="1"/>
     </w:lvlOverride>

</xml_diff>